<commit_message>
Polish ML repo and remove unfinished modules
</commit_message>
<xml_diff>
--- a/docs/model_b/Model_B_Master_Document.docx
+++ b/docs/model_b/Model_B_Master_Document.docx
@@ -49,7 +49,7 @@
         <w:t xml:space="preserve"> </w:t>
       </w:r>
       <w:r>
-        <w:t xml:space="preserve">in the RentAFit project.</w:t>
+        <w:t xml:space="preserve">in RentAFit.</w:t>
       </w:r>
     </w:p>
     <w:p>
@@ -69,23 +69,7 @@
         <w:pStyle w:val="Compact"/>
       </w:pPr>
       <w:r>
-        <w:t xml:space="preserve">a</w:t>
-      </w:r>
-      <w:r>
-        <w:t xml:space="preserve"> </w:t>
-      </w:r>
-      <w:r>
-        <w:rPr>
-          <w:bCs/>
-          <w:b/>
-        </w:rPr>
-        <w:t xml:space="preserve">teacher or evaluator</w:t>
-      </w:r>
-      <w:r>
-        <w:t xml:space="preserve"> </w:t>
-      </w:r>
-      <w:r>
-        <w:t xml:space="preserve">who wants technical clarity,</w:t>
+        <w:t xml:space="preserve">a technical reader who wants clarity,</w:t>
       </w:r>
     </w:p>
     <w:p>
@@ -1964,7 +1948,7 @@
         <w:pStyle w:val="FirstParagraph"/>
       </w:pPr>
       <w:r>
-        <w:t xml:space="preserve">This was the right decision for your project because:</w:t>
+        <w:t xml:space="preserve">This was the right decision for the current system because:</w:t>
       </w:r>
     </w:p>
     <w:p>
@@ -6255,7 +6239,7 @@
         <w:pStyle w:val="FirstParagraph"/>
       </w:pPr>
       <w:r>
-        <w:t xml:space="preserve">Your teacher asked for LSTM, and Model B is the best place to use it.</w:t>
+        <w:t xml:space="preserve">LSTM was used in Model B because it was the most defensible place in the pipeline to introduce sequence modeling.</w:t>
       </w:r>
     </w:p>
     <w:bookmarkStart w:id="78" w:name="core-sequence-used"/>

</xml_diff>